<commit_message>
Corrige colisão de texto na assinatura dos contratos
As três tabelas de assinatura de cada template (contrato, tep, nda,
uso_imagem, aditivo) tinham tblCellMar zerado — zero margem entre as
colunas. Passa despercebido enquanto o nome cabe com folga; quando quase
preenche a coluna inteira (ex.: "JOSÉ ROBERTO SARAIVA COSTA JÚNIOR"), o
texto da coluna ao lado cola direto nele, sem espaço. Reproduzido local
com LibreOffice a partir do .docx real de um contrato já assinado.

Adiciona 108dxa (~0,075", o padrão do Word) de margem esquerda/direita
nas 15 tabelas afetadas.

Co-Authored-By: Claude Sonnet 5 <noreply@anthropic.com>
</commit_message>
<xml_diff>
--- a/src/documentos_contratuais/templates/aditivo.docx
+++ b/src/documentos_contratuais/templates/aditivo.docx
@@ -553,9 +553,9 @@
         </w:tblBorders>
         <w:tblCellMar>
           <w:top w:w="0" w:type="dxa"/>
-          <w:left w:w="0" w:type="dxa"/>
+          <w:left w:w="108" w:type="dxa"/>
           <w:bottom w:w="0" w:type="dxa"/>
-          <w:right w:w="0" w:type="dxa"/>
+          <w:right w:w="108" w:type="dxa"/>
         </w:tblCellMar>
         <w:tblLayout w:type="fixed"/>
       </w:tblPr>
@@ -703,9 +703,9 @@
         </w:tblBorders>
         <w:tblCellMar>
           <w:top w:w="0" w:type="dxa"/>
-          <w:left w:w="0" w:type="dxa"/>
+          <w:left w:w="108" w:type="dxa"/>
           <w:bottom w:w="0" w:type="dxa"/>
-          <w:right w:w="0" w:type="dxa"/>
+          <w:right w:w="108" w:type="dxa"/>
         </w:tblCellMar>
         <w:tblLayout w:type="fixed"/>
       </w:tblPr>
@@ -840,9 +840,9 @@
         </w:tblBorders>
         <w:tblCellMar>
           <w:top w:w="0" w:type="dxa"/>
-          <w:left w:w="0" w:type="dxa"/>
+          <w:left w:w="108" w:type="dxa"/>
           <w:bottom w:w="0" w:type="dxa"/>
-          <w:right w:w="0" w:type="dxa"/>
+          <w:right w:w="108" w:type="dxa"/>
         </w:tblCellMar>
         <w:tblLayout w:type="fixed"/>
       </w:tblPr>

</xml_diff>

<commit_message>
Assinatura não fica mais justificada quando o nome quebra linha
styles.xml define jc="both" (justificado) como padrão de TODO parágrafo
do documento, e as células da tabela de assinatura nunca sobrescreviam
isso. Passa despercebido numa linha só; num nome que precisa quebrar
("JOSÉ ROBERTO SARAIVA COSTA JÚNIOR"), a linha que não é a última do
parágrafo esticava as palavras pra preencher a largura da coluna toda —
o "espaçamento estranho" ainda visível depois do fix de margem de ontem.

Força jc="left" nos 28 parágrafos das 3 tabelas de assinatura de cada um
dos 5 templates.

Co-Authored-By: Claude Sonnet 5 <noreply@anthropic.com>
</commit_message>
<xml_diff>
--- a/src/documentos_contratuais/templates/aditivo.docx
+++ b/src/documentos_contratuais/templates/aditivo.docx
@@ -572,6 +572,9 @@
             <w:tcW w:w="5000" w:type="dxa"/>
           </w:tcPr>
           <w:p>
+            <w:pPr>
+              <w:jc w:val="left"/>
+            </w:pPr>
             <w:r>
               <w:t xml:space="preserve">______________________________</w:t>
             </w:r>
@@ -582,6 +585,9 @@
             <w:tcW w:w="4025" w:type="dxa"/>
           </w:tcPr>
           <w:p>
+            <w:pPr>
+              <w:jc w:val="left"/>
+            </w:pPr>
             <w:r>
               <w:t xml:space="preserve">______________________________</w:t>
             </w:r>
@@ -597,6 +603,9 @@
             <w:tcW w:w="5000" w:type="dxa"/>
           </w:tcPr>
           <w:p>
+            <w:pPr>
+              <w:jc w:val="left"/>
+            </w:pPr>
             <w:r>
               <w:t xml:space="preserve">INSPER JR</w:t>
             </w:r>
@@ -607,6 +616,9 @@
             <w:tcW w:w="4025" w:type="dxa"/>
           </w:tcPr>
           <w:p>
+            <w:pPr>
+              <w:jc w:val="left"/>
+            </w:pPr>
             <w:r>
               <w:t xml:space="preserve">{{ contratante.razao_social }}</w:t>
             </w:r>
@@ -622,6 +634,9 @@
             <w:tcW w:w="5000" w:type="dxa"/>
           </w:tcPr>
           <w:p>
+            <w:pPr>
+              <w:jc w:val="left"/>
+            </w:pPr>
             <w:r>
               <w:t xml:space="preserve">DIRETOR PRESIDENTE</w:t>
             </w:r>
@@ -632,6 +647,9 @@
             <w:tcW w:w="4025" w:type="dxa"/>
           </w:tcPr>
           <w:p>
+            <w:pPr>
+              <w:jc w:val="left"/>
+            </w:pPr>
             <w:r>
               <w:t xml:space="preserve">{{ rep.cargo }}</w:t>
             </w:r>
@@ -647,6 +665,9 @@
             <w:tcW w:w="5000" w:type="dxa"/>
           </w:tcPr>
           <w:p>
+            <w:pPr>
+              <w:jc w:val="left"/>
+            </w:pPr>
             <w:r>
               <w:t xml:space="preserve">{{ presidente.nome }}</w:t>
             </w:r>
@@ -657,6 +678,9 @@
             <w:tcW w:w="4025" w:type="dxa"/>
           </w:tcPr>
           <w:p>
+            <w:pPr>
+              <w:jc w:val="left"/>
+            </w:pPr>
             <w:r>
               <w:t xml:space="preserve">{{ rep.nome }}</w:t>
             </w:r>
@@ -672,6 +696,9 @@
             <w:tcW w:w="5000" w:type="dxa"/>
           </w:tcPr>
           <w:p>
+            <w:pPr>
+              <w:jc w:val="left"/>
+            </w:pPr>
             <w:r>
               <w:t xml:space="preserve">CPF: {{ presidente.cpf }}</w:t>
             </w:r>
@@ -682,6 +709,9 @@
             <w:tcW w:w="4025" w:type="dxa"/>
           </w:tcPr>
           <w:p>
+            <w:pPr>
+              <w:jc w:val="left"/>
+            </w:pPr>
             <w:r>
               <w:t xml:space="preserve">CPF: {{ rep.cpf }}</w:t>
             </w:r>
@@ -722,6 +752,9 @@
             <w:tcW w:w="5000" w:type="dxa"/>
           </w:tcPr>
           <w:p>
+            <w:pPr>
+              <w:jc w:val="left"/>
+            </w:pPr>
             <w:r>
               <w:t xml:space="preserve">______________________________</w:t>
             </w:r>
@@ -732,6 +765,9 @@
             <w:tcW w:w="4025" w:type="dxa"/>
           </w:tcPr>
           <w:p>
+            <w:pPr>
+              <w:jc w:val="left"/>
+            </w:pPr>
             <w:r>
               <w:t xml:space="preserve">______________________________</w:t>
             </w:r>
@@ -747,6 +783,9 @@
             <w:tcW w:w="5000" w:type="dxa"/>
           </w:tcPr>
           <w:p>
+            <w:pPr>
+              <w:jc w:val="left"/>
+            </w:pPr>
             <w:r>
               <w:t xml:space="preserve">TESTEMUNHA</w:t>
             </w:r>
@@ -757,6 +796,9 @@
             <w:tcW w:w="4025" w:type="dxa"/>
           </w:tcPr>
           <w:p>
+            <w:pPr>
+              <w:jc w:val="left"/>
+            </w:pPr>
             <w:r>
               <w:t xml:space="preserve">TESTEMUNHA</w:t>
             </w:r>
@@ -772,6 +814,9 @@
             <w:tcW w:w="5000" w:type="dxa"/>
           </w:tcPr>
           <w:p>
+            <w:pPr>
+              <w:jc w:val="left"/>
+            </w:pPr>
             <w:r>
               <w:rPr>
                 <w:i/>
@@ -785,6 +830,9 @@
             <w:tcW w:w="4025" w:type="dxa"/>
           </w:tcPr>
           <w:p>
+            <w:pPr>
+              <w:jc w:val="left"/>
+            </w:pPr>
             <w:r>
               <w:rPr>
                 <w:i/>
@@ -803,6 +851,9 @@
             <w:tcW w:w="5000" w:type="dxa"/>
           </w:tcPr>
           <w:p>
+            <w:pPr>
+              <w:jc w:val="left"/>
+            </w:pPr>
             <w:r>
               <w:rPr>
                 <w:i/>
@@ -816,6 +867,9 @@
             <w:tcW w:w="4025" w:type="dxa"/>
           </w:tcPr>
           <w:p>
+            <w:pPr>
+              <w:jc w:val="left"/>
+            </w:pPr>
             <w:r>
               <w:rPr>
                 <w:i/>
@@ -859,11 +913,17 @@
             <w:tcW w:w="5000" w:type="dxa"/>
           </w:tcPr>
           <w:p>
+            <w:pPr>
+              <w:jc w:val="left"/>
+            </w:pPr>
             <w:r>
               <w:t xml:space="preserve">______________________________</w:t>
             </w:r>
           </w:p>
           <w:p>
+            <w:pPr>
+              <w:jc w:val="left"/>
+            </w:pPr>
             <w:r>
               <w:t>{%tr if tem_segunda_testemunha %}</w:t>
             </w:r>
@@ -874,6 +934,9 @@
             <w:tcW w:w="4025" w:type="dxa"/>
           </w:tcPr>
           <w:p>
+            <w:pPr>
+              <w:jc w:val="left"/>
+            </w:pPr>
             <w:r>
               <w:t xml:space="preserve">______________________________</w:t>
             </w:r>
@@ -889,6 +952,9 @@
             <w:tcW w:w="5000" w:type="dxa"/>
           </w:tcPr>
           <w:p>
+            <w:pPr>
+              <w:jc w:val="left"/>
+            </w:pPr>
             <w:r>
               <w:t xml:space="preserve">TESTEMUNHA</w:t>
             </w:r>
@@ -899,6 +965,9 @@
             <w:tcW w:w="4025" w:type="dxa"/>
           </w:tcPr>
           <w:p>
+            <w:pPr>
+              <w:jc w:val="left"/>
+            </w:pPr>
             <w:r>
               <w:t xml:space="preserve">TESTEMUNHA</w:t>
             </w:r>
@@ -914,6 +983,9 @@
             <w:tcW w:w="5000" w:type="dxa"/>
           </w:tcPr>
           <w:p>
+            <w:pPr>
+              <w:jc w:val="left"/>
+            </w:pPr>
             <w:r>
               <w:rPr>
                 <w:i/>
@@ -927,6 +999,9 @@
             <w:tcW w:w="4025" w:type="dxa"/>
           </w:tcPr>
           <w:p>
+            <w:pPr>
+              <w:jc w:val="left"/>
+            </w:pPr>
             <w:r>
               <w:rPr>
                 <w:i/>
@@ -945,6 +1020,9 @@
             <w:tcW w:w="5000" w:type="dxa"/>
           </w:tcPr>
           <w:p>
+            <w:pPr>
+              <w:jc w:val="left"/>
+            </w:pPr>
             <w:r>
               <w:rPr>
                 <w:i/>
@@ -958,6 +1036,9 @@
             <w:tcW w:w="4025" w:type="dxa"/>
           </w:tcPr>
           <w:p>
+            <w:pPr>
+              <w:jc w:val="left"/>
+            </w:pPr>
             <w:r>
               <w:rPr>
                 <w:i/>
@@ -966,6 +1047,9 @@
             </w:r>
           </w:p>
           <w:p>
+            <w:pPr>
+              <w:jc w:val="left"/>
+            </w:pPr>
             <w:r>
               <w:t>{%tr endif %}</w:t>
             </w:r>

</xml_diff>